<commit_message>
report rebuilt with the latest passing ci run
</commit_message>
<xml_diff>
--- a/out/MaltaShop_Microservices_Report.docx
+++ b/out/MaltaShop_Microservices_Report.docx
@@ -18985,7 +18985,7 @@
     <w:p>
       <w:pPr>
         <w:pStyle w:val="CodeListing"/>
-        <w:keepNext w:val="0"/>
+        <w:keepNext/>
         <w:shd w:val="clear" w:color="auto" w:fill="F2F2F2"/>
       </w:pPr>
       <w:r>
@@ -18994,6 +18994,76 @@
           <w:sz w:val="15"/>
         </w:rPr>
         <w:t>643179a  2026-10-05 10:29  evidence: demo capture script, transcripts and screenshots of the running prototype</w:t>
+      </w:r>
+    </w:p>
+    <w:p>
+      <w:pPr>
+        <w:pStyle w:val="CodeListing"/>
+        <w:keepNext/>
+        <w:shd w:val="clear" w:color="auto" w:fill="F2F2F2"/>
+      </w:pPr>
+      <w:r>
+        <w:rPr>
+          <w:rFonts w:ascii="Courier New" w:hAnsi="Courier New" w:eastAsia="Courier New" w:cs="Courier New"/>
+          <w:sz w:val="15"/>
+        </w:rPr>
+        <w:t>d4114f7  2026-10-05 10:54  order service: wrap long lines that the report quotes</w:t>
+      </w:r>
+    </w:p>
+    <w:p>
+      <w:pPr>
+        <w:pStyle w:val="CodeListing"/>
+        <w:keepNext/>
+        <w:shd w:val="clear" w:color="auto" w:fill="F2F2F2"/>
+      </w:pPr>
+      <w:r>
+        <w:rPr>
+          <w:rFonts w:ascii="Courier New" w:hAnsi="Courier New" w:eastAsia="Courier New" w:cs="Courier New"/>
+          <w:sz w:val="15"/>
+        </w:rPr>
+        <w:t>2192cf9  2026-10-05 10:54  evidence: larger terminal text, tighter crops and the ci run screenshot</w:t>
+      </w:r>
+    </w:p>
+    <w:p>
+      <w:pPr>
+        <w:pStyle w:val="CodeListing"/>
+        <w:keepNext/>
+        <w:shd w:val="clear" w:color="auto" w:fill="F2F2F2"/>
+      </w:pPr>
+      <w:r>
+        <w:rPr>
+          <w:rFonts w:ascii="Courier New" w:hAnsi="Courier New" w:eastAsia="Courier New" w:cs="Courier New"/>
+          <w:sz w:val="15"/>
+        </w:rPr>
+        <w:t>1dac862  2026-10-05 10:54  docs: architecture decision records; readme covers docs, evidence and report</w:t>
+      </w:r>
+    </w:p>
+    <w:p>
+      <w:pPr>
+        <w:pStyle w:val="CodeListing"/>
+        <w:keepNext/>
+        <w:shd w:val="clear" w:color="auto" w:fill="F2F2F2"/>
+      </w:pPr>
+      <w:r>
+        <w:rPr>
+          <w:rFonts w:ascii="Courier New" w:hAnsi="Courier New" w:eastAsia="Courier New" w:cs="Courier New"/>
+          <w:sz w:val="15"/>
+        </w:rPr>
+        <w:t>092eb10  2026-10-05 10:54  report: sections 1 to 6, references and the build scripts</w:t>
+      </w:r>
+    </w:p>
+    <w:p>
+      <w:pPr>
+        <w:pStyle w:val="CodeListing"/>
+        <w:keepNext w:val="0"/>
+        <w:shd w:val="clear" w:color="auto" w:fill="F2F2F2"/>
+      </w:pPr>
+      <w:r>
+        <w:rPr>
+          <w:rFonts w:ascii="Courier New" w:hAnsi="Courier New" w:eastAsia="Courier New" w:cs="Courier New"/>
+          <w:sz w:val="15"/>
+        </w:rPr>
+        <w:t>1b68926  2026-10-05 10:54  report built (pdf and word)</w:t>
       </w:r>
     </w:p>
     <w:p>

</xml_diff>

<commit_message>
report rebuilt after the history rewrite
</commit_message>
<xml_diff>
--- a/out/MaltaShop_Microservices_Report.docx
+++ b/out/MaltaShop_Microservices_Report.docx
@@ -18839,7 +18839,7 @@
           <w:rFonts w:ascii="Courier New" w:hAnsi="Courier New" w:eastAsia="Courier New" w:cs="Courier New"/>
           <w:sz w:val="15"/>
         </w:rPr>
-        <w:t>fa69137  2026-10-05 10:02  project skeleton and readme outline</w:t>
+        <w:t>f47524f  2026-10-05 10:02  project skeleton and readme outline</w:t>
       </w:r>
     </w:p>
     <w:p>
@@ -18853,7 +18853,7 @@
           <w:rFonts w:ascii="Courier New" w:hAnsi="Courier New" w:eastAsia="Courier New" w:cs="Courier New"/>
           <w:sz w:val="15"/>
         </w:rPr>
-        <w:t>9f14f67  2026-10-05 10:04  order service: order rules, pricing and OrderPlaced event with unit tests</w:t>
+        <w:t>56b5272  2026-10-05 10:04  order service: order rules, pricing and OrderPlaced event with unit tests</w:t>
       </w:r>
     </w:p>
     <w:p>
@@ -18867,7 +18867,7 @@
           <w:rFonts w:ascii="Courier New" w:hAnsi="Courier New" w:eastAsia="Courier New" w:cs="Courier New"/>
           <w:sz w:val="15"/>
         </w:rPr>
-        <w:t>df55546  2026-10-05 10:06  order service: POST /orders with PostgreSQL, idempotency key and outbox table</w:t>
+        <w:t>bcc2e31  2026-10-05 10:06  order service: POST /orders with PostgreSQL, idempotency key and outbox table</w:t>
       </w:r>
     </w:p>
     <w:p>
@@ -18881,7 +18881,7 @@
           <w:rFonts w:ascii="Courier New" w:hAnsi="Courier New" w:eastAsia="Courier New" w:cs="Courier New"/>
           <w:sz w:val="15"/>
         </w:rPr>
-        <w:t>393458d  2026-10-05 10:10  order service: outbox relay publishes OrderPlaced to RabbitMQ with publisher confirms</w:t>
+        <w:t>1b55810  2026-10-05 10:10  order service: outbox relay publishes OrderPlaced to RabbitMQ with publisher confirms</w:t>
       </w:r>
     </w:p>
     <w:p>
@@ -18895,7 +18895,7 @@
           <w:rFonts w:ascii="Courier New" w:hAnsi="Courier New" w:eastAsia="Courier New" w:cs="Courier New"/>
           <w:sz w:val="15"/>
         </w:rPr>
-        <w:t>95b02c4  2026-10-05 10:11  notification service: idempotent OrderPlaced consumer with MongoDB store and dead-letter queue</w:t>
+        <w:t>9ae0ca9  2026-10-05 10:11  notification service: idempotent OrderPlaced consumer with MongoDB store and dead-letter queue</w:t>
       </w:r>
     </w:p>
     <w:p>
@@ -18909,7 +18909,7 @@
           <w:rFonts w:ascii="Courier New" w:hAnsi="Courier New" w:eastAsia="Courier New" w:cs="Courier New"/>
           <w:sz w:val="15"/>
         </w:rPr>
-        <w:t>e720307  2026-10-05 10:14  dockerfiles for both services and docker compose for the whole system</w:t>
+        <w:t>b066a7e  2026-10-05 10:14  dockerfiles for both services and docker compose for the whole system</w:t>
       </w:r>
     </w:p>
     <w:p>
@@ -18923,7 +18923,7 @@
           <w:rFonts w:ascii="Courier New" w:hAnsi="Courier New" w:eastAsia="Courier New" w:cs="Courier New"/>
           <w:sz w:val="15"/>
         </w:rPr>
-        <w:t>0828c68  2026-10-05 10:15  OrderPlaced contract with provider and consumer contract tests, end-to-end smoke test</w:t>
+        <w:t>deaa8e7  2026-10-05 10:15  OrderPlaced contract with provider and consumer contract tests, end-to-end smoke test</w:t>
       </w:r>
     </w:p>
     <w:p>
@@ -18937,7 +18937,7 @@
           <w:rFonts w:ascii="Courier New" w:hAnsi="Courier New" w:eastAsia="Courier New" w:cs="Courier New"/>
           <w:sz w:val="15"/>
         </w:rPr>
-        <w:t>2b70c17  2026-10-05 10:16  ci: test, build-once image push to GHCR, and integration stage on the built images</w:t>
+        <w:t>30dacf7  2026-10-05 10:16  ci: test, build-once image push to GHCR, and integration stage on the built images</w:t>
       </w:r>
     </w:p>
     <w:p>
@@ -18951,7 +18951,7 @@
           <w:rFonts w:ascii="Courier New" w:hAnsi="Courier New" w:eastAsia="Courier New" w:cs="Courier New"/>
           <w:sz w:val="15"/>
         </w:rPr>
-        <w:t>bd64289  2026-10-05 10:16  readme: what the system is, how to run it, endpoints and environment variables</w:t>
+        <w:t>c727c9d  2026-10-05 10:16  readme: what the system is, how to run it, endpoints and environment variables</w:t>
       </w:r>
     </w:p>
     <w:p>
@@ -18965,7 +18965,7 @@
           <w:rFonts w:ascii="Courier New" w:hAnsi="Courier New" w:eastAsia="Courier New" w:cs="Courier New"/>
           <w:sz w:val="15"/>
         </w:rPr>
-        <w:t>d734444  2026-10-05 10:22  ci: pin actions to commit SHAs, move to node24 releases, pin runner to ubuntu-24.04</w:t>
+        <w:t>55423a0  2026-10-05 10:22  ci: pin actions to commit SHAs, move to node24 releases, pin runner to ubuntu-24.04</w:t>
       </w:r>
     </w:p>
     <w:p>
@@ -18979,7 +18979,7 @@
           <w:rFonts w:ascii="Courier New" w:hAnsi="Courier New" w:eastAsia="Courier New" w:cs="Courier New"/>
           <w:sz w:val="15"/>
         </w:rPr>
-        <w:t>ce0fd98  2026-10-05 10:25  diagrams: architecture, ci/cd pipeline, observability, saga and prototype topology</w:t>
+        <w:t>ae9e7fa  2026-10-05 10:25  diagrams: architecture, ci/cd pipeline, observability, saga and prototype topology</w:t>
       </w:r>
     </w:p>
     <w:p>
@@ -18993,7 +18993,7 @@
           <w:rFonts w:ascii="Courier New" w:hAnsi="Courier New" w:eastAsia="Courier New" w:cs="Courier New"/>
           <w:sz w:val="15"/>
         </w:rPr>
-        <w:t>643179a  2026-10-05 10:29  evidence: demo capture script, transcripts and screenshots of the running prototype</w:t>
+        <w:t>df25e1b  2026-10-05 10:29  evidence: demo capture script, transcripts and screenshots of the running prototype</w:t>
       </w:r>
     </w:p>
     <w:p>
@@ -19007,7 +19007,7 @@
           <w:rFonts w:ascii="Courier New" w:hAnsi="Courier New" w:eastAsia="Courier New" w:cs="Courier New"/>
           <w:sz w:val="15"/>
         </w:rPr>
-        <w:t>d4114f7  2026-10-05 10:54  order service: wrap long lines that the report quotes</w:t>
+        <w:t>869c520  2026-10-05 10:54  order service: wrap long lines that the report quotes</w:t>
       </w:r>
     </w:p>
     <w:p>
@@ -19021,7 +19021,7 @@
           <w:rFonts w:ascii="Courier New" w:hAnsi="Courier New" w:eastAsia="Courier New" w:cs="Courier New"/>
           <w:sz w:val="15"/>
         </w:rPr>
-        <w:t>2192cf9  2026-10-05 10:54  evidence: larger terminal text, tighter crops and the ci run screenshot</w:t>
+        <w:t>cb1f0f6  2026-10-05 10:54  evidence: larger terminal text, tighter crops and the ci run screenshot</w:t>
       </w:r>
     </w:p>
     <w:p>
@@ -19035,7 +19035,7 @@
           <w:rFonts w:ascii="Courier New" w:hAnsi="Courier New" w:eastAsia="Courier New" w:cs="Courier New"/>
           <w:sz w:val="15"/>
         </w:rPr>
-        <w:t>1dac862  2026-10-05 10:54  docs: architecture decision records; readme covers docs, evidence and report</w:t>
+        <w:t>11193e5  2026-10-05 10:54  docs: architecture decision records; readme covers docs, evidence and report</w:t>
       </w:r>
     </w:p>
     <w:p>
@@ -19049,21 +19049,35 @@
           <w:rFonts w:ascii="Courier New" w:hAnsi="Courier New" w:eastAsia="Courier New" w:cs="Courier New"/>
           <w:sz w:val="15"/>
         </w:rPr>
-        <w:t>092eb10  2026-10-05 10:54  report: sections 1 to 6, references and the build scripts</w:t>
-      </w:r>
-    </w:p>
-    <w:p>
-      <w:pPr>
-        <w:pStyle w:val="CodeListing"/>
-        <w:keepNext w:val="0"/>
-        <w:shd w:val="clear" w:color="auto" w:fill="F2F2F2"/>
-      </w:pPr>
-      <w:r>
-        <w:rPr>
-          <w:rFonts w:ascii="Courier New" w:hAnsi="Courier New" w:eastAsia="Courier New" w:cs="Courier New"/>
-          <w:sz w:val="15"/>
-        </w:rPr>
-        <w:t>1b68926  2026-10-05 10:54  report built (pdf and word)</w:t>
+        <w:t>343bb64  2026-10-05 10:54  report: sections 1 to 6, references and the build scripts</w:t>
+      </w:r>
+    </w:p>
+    <w:p>
+      <w:pPr>
+        <w:pStyle w:val="CodeListing"/>
+        <w:keepNext/>
+        <w:shd w:val="clear" w:color="auto" w:fill="F2F2F2"/>
+      </w:pPr>
+      <w:r>
+        <w:rPr>
+          <w:rFonts w:ascii="Courier New" w:hAnsi="Courier New" w:eastAsia="Courier New" w:cs="Courier New"/>
+          <w:sz w:val="15"/>
+        </w:rPr>
+        <w:t>bd1815b  2026-10-05 10:54  report built (pdf and word)</w:t>
+      </w:r>
+    </w:p>
+    <w:p>
+      <w:pPr>
+        <w:pStyle w:val="CodeListing"/>
+        <w:keepNext w:val="0"/>
+        <w:shd w:val="clear" w:color="auto" w:fill="F2F2F2"/>
+      </w:pPr>
+      <w:r>
+        <w:rPr>
+          <w:rFonts w:ascii="Courier New" w:hAnsi="Courier New" w:eastAsia="Courier New" w:cs="Courier New"/>
+          <w:sz w:val="15"/>
+        </w:rPr>
+        <w:t>343b191  2026-10-05 10:57  report rebuilt with the latest passing ci run</w:t>
       </w:r>
     </w:p>
     <w:p>

</xml_diff>

<commit_message>
report rebuilt with clickable links
</commit_message>
<xml_diff>
--- a/out/MaltaShop_Microservices_Report.docx
+++ b/out/MaltaShop_Microservices_Report.docx
@@ -17810,13 +17810,21 @@
           <w:i w:val="0"/>
           <w:sz w:val="24"/>
         </w:rPr>
-        <w:t>. Available at: https://docs.docker.com/build/building/multi-stage/ (Accessed: 5 October 2026).</w:t>
-      </w:r>
-    </w:p>
-    <w:p>
-      <w:pPr>
-        <w:ind w:left="567" w:hanging="567"/>
-      </w:pPr>
+        <w:t xml:space="preserve">. Available at: </w:t>
+      </w:r>
+      <w:hyperlink r:id="rId28">
+        <w:r>
+          <w:rPr>
+            <w:rFonts w:ascii="Times New Roman" w:hAnsi="Times New Roman" w:eastAsia="Times New Roman" w:cs="Times New Roman"/>
+            <w:b w:val="0"/>
+            <w:i w:val="0"/>
+            <w:color w:val="0563C1"/>
+            <w:sz w:val="24"/>
+            <w:u w:val="single"/>
+          </w:rPr>
+          <w:t>https://docs.docker.com/build/building/multi-stage/</w:t>
+        </w:r>
+      </w:hyperlink>
       <w:r>
         <w:rPr>
           <w:rFonts w:ascii="Times New Roman" w:hAnsi="Times New Roman" w:eastAsia="Times New Roman" w:cs="Times New Roman"/>
@@ -17824,6 +17832,20 @@
           <w:i w:val="0"/>
           <w:sz w:val="24"/>
         </w:rPr>
+        <w:t xml:space="preserve"> (Accessed: 5 October 2026).</w:t>
+      </w:r>
+    </w:p>
+    <w:p>
+      <w:pPr>
+        <w:ind w:left="567" w:hanging="567"/>
+      </w:pPr>
+      <w:r>
+        <w:rPr>
+          <w:rFonts w:ascii="Times New Roman" w:hAnsi="Times New Roman" w:eastAsia="Times New Roman" w:cs="Times New Roman"/>
+          <w:b w:val="0"/>
+          <w:i w:val="0"/>
+          <w:sz w:val="24"/>
+        </w:rPr>
         <w:t xml:space="preserve">Erl, T. (2005) </w:t>
       </w:r>
       <w:r>
@@ -17938,13 +17960,21 @@
           <w:i w:val="0"/>
           <w:sz w:val="24"/>
         </w:rPr>
-        <w:t>. Available at: https://martinfowler.com/bliki/StranglerFigApplication.html (Accessed: 5 October 2026).</w:t>
-      </w:r>
-    </w:p>
-    <w:p>
-      <w:pPr>
-        <w:ind w:left="567" w:hanging="567"/>
-      </w:pPr>
+        <w:t xml:space="preserve">. Available at: </w:t>
+      </w:r>
+      <w:hyperlink r:id="rId29">
+        <w:r>
+          <w:rPr>
+            <w:rFonts w:ascii="Times New Roman" w:hAnsi="Times New Roman" w:eastAsia="Times New Roman" w:cs="Times New Roman"/>
+            <w:b w:val="0"/>
+            <w:i w:val="0"/>
+            <w:color w:val="0563C1"/>
+            <w:sz w:val="24"/>
+            <w:u w:val="single"/>
+          </w:rPr>
+          <w:t>https://martinfowler.com/bliki/StranglerFigApplication.html</w:t>
+        </w:r>
+      </w:hyperlink>
       <w:r>
         <w:rPr>
           <w:rFonts w:ascii="Times New Roman" w:hAnsi="Times New Roman" w:eastAsia="Times New Roman" w:cs="Times New Roman"/>
@@ -17952,6 +17982,20 @@
           <w:i w:val="0"/>
           <w:sz w:val="24"/>
         </w:rPr>
+        <w:t xml:space="preserve"> (Accessed: 5 October 2026).</w:t>
+      </w:r>
+    </w:p>
+    <w:p>
+      <w:pPr>
+        <w:ind w:left="567" w:hanging="567"/>
+      </w:pPr>
+      <w:r>
+        <w:rPr>
+          <w:rFonts w:ascii="Times New Roman" w:hAnsi="Times New Roman" w:eastAsia="Times New Roman" w:cs="Times New Roman"/>
+          <w:b w:val="0"/>
+          <w:i w:val="0"/>
+          <w:sz w:val="24"/>
+        </w:rPr>
         <w:t xml:space="preserve">Fowler, M. (2010) </w:t>
       </w:r>
       <w:r>
@@ -17970,13 +18014,21 @@
           <w:i w:val="0"/>
           <w:sz w:val="24"/>
         </w:rPr>
-        <w:t>. Available at: https://martinfowler.com/bliki/BlueGreenDeployment.html (Accessed: 5 October 2026).</w:t>
-      </w:r>
-    </w:p>
-    <w:p>
-      <w:pPr>
-        <w:ind w:left="567" w:hanging="567"/>
-      </w:pPr>
+        <w:t xml:space="preserve">. Available at: </w:t>
+      </w:r>
+      <w:hyperlink r:id="rId30">
+        <w:r>
+          <w:rPr>
+            <w:rFonts w:ascii="Times New Roman" w:hAnsi="Times New Roman" w:eastAsia="Times New Roman" w:cs="Times New Roman"/>
+            <w:b w:val="0"/>
+            <w:i w:val="0"/>
+            <w:color w:val="0563C1"/>
+            <w:sz w:val="24"/>
+            <w:u w:val="single"/>
+          </w:rPr>
+          <w:t>https://martinfowler.com/bliki/BlueGreenDeployment.html</w:t>
+        </w:r>
+      </w:hyperlink>
       <w:r>
         <w:rPr>
           <w:rFonts w:ascii="Times New Roman" w:hAnsi="Times New Roman" w:eastAsia="Times New Roman" w:cs="Times New Roman"/>
@@ -17984,6 +18036,20 @@
           <w:i w:val="0"/>
           <w:sz w:val="24"/>
         </w:rPr>
+        <w:t xml:space="preserve"> (Accessed: 5 October 2026).</w:t>
+      </w:r>
+    </w:p>
+    <w:p>
+      <w:pPr>
+        <w:ind w:left="567" w:hanging="567"/>
+      </w:pPr>
+      <w:r>
+        <w:rPr>
+          <w:rFonts w:ascii="Times New Roman" w:hAnsi="Times New Roman" w:eastAsia="Times New Roman" w:cs="Times New Roman"/>
+          <w:b w:val="0"/>
+          <w:i w:val="0"/>
+          <w:sz w:val="24"/>
+        </w:rPr>
         <w:t xml:space="preserve">Fowler, M. (2015) </w:t>
       </w:r>
       <w:r>
@@ -18002,13 +18068,21 @@
           <w:i w:val="0"/>
           <w:sz w:val="24"/>
         </w:rPr>
-        <w:t>. Available at: https://martinfowler.com/bliki/MonolithFirst.html (Accessed: 5 October 2026).</w:t>
-      </w:r>
-    </w:p>
-    <w:p>
-      <w:pPr>
-        <w:ind w:left="567" w:hanging="567"/>
-      </w:pPr>
+        <w:t xml:space="preserve">. Available at: </w:t>
+      </w:r>
+      <w:hyperlink r:id="rId31">
+        <w:r>
+          <w:rPr>
+            <w:rFonts w:ascii="Times New Roman" w:hAnsi="Times New Roman" w:eastAsia="Times New Roman" w:cs="Times New Roman"/>
+            <w:b w:val="0"/>
+            <w:i w:val="0"/>
+            <w:color w:val="0563C1"/>
+            <w:sz w:val="24"/>
+            <w:u w:val="single"/>
+          </w:rPr>
+          <w:t>https://martinfowler.com/bliki/MonolithFirst.html</w:t>
+        </w:r>
+      </w:hyperlink>
       <w:r>
         <w:rPr>
           <w:rFonts w:ascii="Times New Roman" w:hAnsi="Times New Roman" w:eastAsia="Times New Roman" w:cs="Times New Roman"/>
@@ -18016,6 +18090,20 @@
           <w:i w:val="0"/>
           <w:sz w:val="24"/>
         </w:rPr>
+        <w:t xml:space="preserve"> (Accessed: 5 October 2026).</w:t>
+      </w:r>
+    </w:p>
+    <w:p>
+      <w:pPr>
+        <w:ind w:left="567" w:hanging="567"/>
+      </w:pPr>
+      <w:r>
+        <w:rPr>
+          <w:rFonts w:ascii="Times New Roman" w:hAnsi="Times New Roman" w:eastAsia="Times New Roman" w:cs="Times New Roman"/>
+          <w:b w:val="0"/>
+          <w:i w:val="0"/>
+          <w:sz w:val="24"/>
+        </w:rPr>
         <w:t xml:space="preserve">Garcia-Molina, H. and Salem, K. (1987) 'Sagas', </w:t>
       </w:r>
       <w:r>
@@ -18066,13 +18154,21 @@
           <w:i w:val="0"/>
           <w:sz w:val="24"/>
         </w:rPr>
-        <w:t>. Available at: https://trunkbaseddevelopment.com (Accessed: 5 October 2026).</w:t>
-      </w:r>
-    </w:p>
-    <w:p>
-      <w:pPr>
-        <w:ind w:left="567" w:hanging="567"/>
-      </w:pPr>
+        <w:t xml:space="preserve">. Available at: </w:t>
+      </w:r>
+      <w:hyperlink r:id="rId32">
+        <w:r>
+          <w:rPr>
+            <w:rFonts w:ascii="Times New Roman" w:hAnsi="Times New Roman" w:eastAsia="Times New Roman" w:cs="Times New Roman"/>
+            <w:b w:val="0"/>
+            <w:i w:val="0"/>
+            <w:color w:val="0563C1"/>
+            <w:sz w:val="24"/>
+            <w:u w:val="single"/>
+          </w:rPr>
+          <w:t>https://trunkbaseddevelopment.com</w:t>
+        </w:r>
+      </w:hyperlink>
       <w:r>
         <w:rPr>
           <w:rFonts w:ascii="Times New Roman" w:hAnsi="Times New Roman" w:eastAsia="Times New Roman" w:cs="Times New Roman"/>
@@ -18080,6 +18176,20 @@
           <w:i w:val="0"/>
           <w:sz w:val="24"/>
         </w:rPr>
+        <w:t xml:space="preserve"> (Accessed: 5 October 2026).</w:t>
+      </w:r>
+    </w:p>
+    <w:p>
+      <w:pPr>
+        <w:ind w:left="567" w:hanging="567"/>
+      </w:pPr>
+      <w:r>
+        <w:rPr>
+          <w:rFonts w:ascii="Times New Roman" w:hAnsi="Times New Roman" w:eastAsia="Times New Roman" w:cs="Times New Roman"/>
+          <w:b w:val="0"/>
+          <w:i w:val="0"/>
+          <w:sz w:val="24"/>
+        </w:rPr>
         <w:t xml:space="preserve">Humble, J. and Farley, D. (2010) </w:t>
       </w:r>
       <w:r>
@@ -18130,13 +18240,21 @@
           <w:i w:val="0"/>
           <w:sz w:val="24"/>
         </w:rPr>
-        <w:t>. Available at: https://istio.io/latest/about/service-mesh/ (Accessed: 5 October 2026).</w:t>
-      </w:r>
-    </w:p>
-    <w:p>
-      <w:pPr>
-        <w:ind w:left="567" w:hanging="567"/>
-      </w:pPr>
+        <w:t xml:space="preserve">. Available at: </w:t>
+      </w:r>
+      <w:hyperlink r:id="rId33">
+        <w:r>
+          <w:rPr>
+            <w:rFonts w:ascii="Times New Roman" w:hAnsi="Times New Roman" w:eastAsia="Times New Roman" w:cs="Times New Roman"/>
+            <w:b w:val="0"/>
+            <w:i w:val="0"/>
+            <w:color w:val="0563C1"/>
+            <w:sz w:val="24"/>
+            <w:u w:val="single"/>
+          </w:rPr>
+          <w:t>https://istio.io/latest/about/service-mesh/</w:t>
+        </w:r>
+      </w:hyperlink>
       <w:r>
         <w:rPr>
           <w:rFonts w:ascii="Times New Roman" w:hAnsi="Times New Roman" w:eastAsia="Times New Roman" w:cs="Times New Roman"/>
@@ -18144,6 +18262,20 @@
           <w:i w:val="0"/>
           <w:sz w:val="24"/>
         </w:rPr>
+        <w:t xml:space="preserve"> (Accessed: 5 October 2026).</w:t>
+      </w:r>
+    </w:p>
+    <w:p>
+      <w:pPr>
+        <w:ind w:left="567" w:hanging="567"/>
+      </w:pPr>
+      <w:r>
+        <w:rPr>
+          <w:rFonts w:ascii="Times New Roman" w:hAnsi="Times New Roman" w:eastAsia="Times New Roman" w:cs="Times New Roman"/>
+          <w:b w:val="0"/>
+          <w:i w:val="0"/>
+          <w:sz w:val="24"/>
+        </w:rPr>
         <w:t xml:space="preserve">Kubernetes (n.d.a) </w:t>
       </w:r>
       <w:r>
@@ -18162,13 +18294,21 @@
           <w:i w:val="0"/>
           <w:sz w:val="24"/>
         </w:rPr>
-        <w:t>. Available at: https://kubernetes.io/docs/tasks/configure-pod-container/configure-liveness-readiness-startup-probes/ (Accessed: 5 October 2026).</w:t>
-      </w:r>
-    </w:p>
-    <w:p>
-      <w:pPr>
-        <w:ind w:left="567" w:hanging="567"/>
-      </w:pPr>
+        <w:t xml:space="preserve">. Available at: </w:t>
+      </w:r>
+      <w:hyperlink r:id="rId34">
+        <w:r>
+          <w:rPr>
+            <w:rFonts w:ascii="Times New Roman" w:hAnsi="Times New Roman" w:eastAsia="Times New Roman" w:cs="Times New Roman"/>
+            <w:b w:val="0"/>
+            <w:i w:val="0"/>
+            <w:color w:val="0563C1"/>
+            <w:sz w:val="24"/>
+            <w:u w:val="single"/>
+          </w:rPr>
+          <w:t>https://kubernetes.io/docs/tasks/configure-pod-container/configure-liveness-readiness-startup-probes/</w:t>
+        </w:r>
+      </w:hyperlink>
       <w:r>
         <w:rPr>
           <w:rFonts w:ascii="Times New Roman" w:hAnsi="Times New Roman" w:eastAsia="Times New Roman" w:cs="Times New Roman"/>
@@ -18176,6 +18316,20 @@
           <w:i w:val="0"/>
           <w:sz w:val="24"/>
         </w:rPr>
+        <w:t xml:space="preserve"> (Accessed: 5 October 2026).</w:t>
+      </w:r>
+    </w:p>
+    <w:p>
+      <w:pPr>
+        <w:ind w:left="567" w:hanging="567"/>
+      </w:pPr>
+      <w:r>
+        <w:rPr>
+          <w:rFonts w:ascii="Times New Roman" w:hAnsi="Times New Roman" w:eastAsia="Times New Roman" w:cs="Times New Roman"/>
+          <w:b w:val="0"/>
+          <w:i w:val="0"/>
+          <w:sz w:val="24"/>
+        </w:rPr>
         <w:t xml:space="preserve">Kubernetes (n.d.b) </w:t>
       </w:r>
       <w:r>
@@ -18194,13 +18348,21 @@
           <w:i w:val="0"/>
           <w:sz w:val="24"/>
         </w:rPr>
-        <w:t>. Available at: https://kubernetes.io/docs/tasks/run-application/horizontal-pod-autoscale/ (Accessed: 5 October 2026).</w:t>
-      </w:r>
-    </w:p>
-    <w:p>
-      <w:pPr>
-        <w:ind w:left="567" w:hanging="567"/>
-      </w:pPr>
+        <w:t xml:space="preserve">. Available at: </w:t>
+      </w:r>
+      <w:hyperlink r:id="rId35">
+        <w:r>
+          <w:rPr>
+            <w:rFonts w:ascii="Times New Roman" w:hAnsi="Times New Roman" w:eastAsia="Times New Roman" w:cs="Times New Roman"/>
+            <w:b w:val="0"/>
+            <w:i w:val="0"/>
+            <w:color w:val="0563C1"/>
+            <w:sz w:val="24"/>
+            <w:u w:val="single"/>
+          </w:rPr>
+          <w:t>https://kubernetes.io/docs/tasks/run-application/horizontal-pod-autoscale/</w:t>
+        </w:r>
+      </w:hyperlink>
       <w:r>
         <w:rPr>
           <w:rFonts w:ascii="Times New Roman" w:hAnsi="Times New Roman" w:eastAsia="Times New Roman" w:cs="Times New Roman"/>
@@ -18208,6 +18370,20 @@
           <w:i w:val="0"/>
           <w:sz w:val="24"/>
         </w:rPr>
+        <w:t xml:space="preserve"> (Accessed: 5 October 2026).</w:t>
+      </w:r>
+    </w:p>
+    <w:p>
+      <w:pPr>
+        <w:ind w:left="567" w:hanging="567"/>
+      </w:pPr>
+      <w:r>
+        <w:rPr>
+          <w:rFonts w:ascii="Times New Roman" w:hAnsi="Times New Roman" w:eastAsia="Times New Roman" w:cs="Times New Roman"/>
+          <w:b w:val="0"/>
+          <w:i w:val="0"/>
+          <w:sz w:val="24"/>
+        </w:rPr>
         <w:t xml:space="preserve">Lewis, J. and Fowler, M. (2014) </w:t>
       </w:r>
       <w:r>
@@ -18226,13 +18402,21 @@
           <w:i w:val="0"/>
           <w:sz w:val="24"/>
         </w:rPr>
-        <w:t>. Available at: https://martinfowler.com/articles/microservices.html (Accessed: 5 October 2026).</w:t>
-      </w:r>
-    </w:p>
-    <w:p>
-      <w:pPr>
-        <w:ind w:left="567" w:hanging="567"/>
-      </w:pPr>
+        <w:t xml:space="preserve">. Available at: </w:t>
+      </w:r>
+      <w:hyperlink r:id="rId36">
+        <w:r>
+          <w:rPr>
+            <w:rFonts w:ascii="Times New Roman" w:hAnsi="Times New Roman" w:eastAsia="Times New Roman" w:cs="Times New Roman"/>
+            <w:b w:val="0"/>
+            <w:i w:val="0"/>
+            <w:color w:val="0563C1"/>
+            <w:sz w:val="24"/>
+            <w:u w:val="single"/>
+          </w:rPr>
+          <w:t>https://martinfowler.com/articles/microservices.html</w:t>
+        </w:r>
+      </w:hyperlink>
       <w:r>
         <w:rPr>
           <w:rFonts w:ascii="Times New Roman" w:hAnsi="Times New Roman" w:eastAsia="Times New Roman" w:cs="Times New Roman"/>
@@ -18240,6 +18424,20 @@
           <w:i w:val="0"/>
           <w:sz w:val="24"/>
         </w:rPr>
+        <w:t xml:space="preserve"> (Accessed: 5 October 2026).</w:t>
+      </w:r>
+    </w:p>
+    <w:p>
+      <w:pPr>
+        <w:ind w:left="567" w:hanging="567"/>
+      </w:pPr>
+      <w:r>
+        <w:rPr>
+          <w:rFonts w:ascii="Times New Roman" w:hAnsi="Times New Roman" w:eastAsia="Times New Roman" w:cs="Times New Roman"/>
+          <w:b w:val="0"/>
+          <w:i w:val="0"/>
+          <w:sz w:val="24"/>
+        </w:rPr>
         <w:t xml:space="preserve">Newman, S. (2021) </w:t>
       </w:r>
       <w:r>
@@ -18290,13 +18488,21 @@
           <w:i w:val="0"/>
           <w:sz w:val="24"/>
         </w:rPr>
-        <w:t>. Available at: https://cognitect.com/blog/2011/11/15/documenting-architecture-decisions (Accessed: 5 October 2026).</w:t>
-      </w:r>
-    </w:p>
-    <w:p>
-      <w:pPr>
-        <w:ind w:left="567" w:hanging="567"/>
-      </w:pPr>
+        <w:t xml:space="preserve">. Available at: </w:t>
+      </w:r>
+      <w:hyperlink r:id="rId37">
+        <w:r>
+          <w:rPr>
+            <w:rFonts w:ascii="Times New Roman" w:hAnsi="Times New Roman" w:eastAsia="Times New Roman" w:cs="Times New Roman"/>
+            <w:b w:val="0"/>
+            <w:i w:val="0"/>
+            <w:color w:val="0563C1"/>
+            <w:sz w:val="24"/>
+            <w:u w:val="single"/>
+          </w:rPr>
+          <w:t>https://cognitect.com/blog/2011/11/15/documenting-architecture-decisions</w:t>
+        </w:r>
+      </w:hyperlink>
       <w:r>
         <w:rPr>
           <w:rFonts w:ascii="Times New Roman" w:hAnsi="Times New Roman" w:eastAsia="Times New Roman" w:cs="Times New Roman"/>
@@ -18304,6 +18510,20 @@
           <w:i w:val="0"/>
           <w:sz w:val="24"/>
         </w:rPr>
+        <w:t xml:space="preserve"> (Accessed: 5 October 2026).</w:t>
+      </w:r>
+    </w:p>
+    <w:p>
+      <w:pPr>
+        <w:ind w:left="567" w:hanging="567"/>
+      </w:pPr>
+      <w:r>
+        <w:rPr>
+          <w:rFonts w:ascii="Times New Roman" w:hAnsi="Times New Roman" w:eastAsia="Times New Roman" w:cs="Times New Roman"/>
+          <w:b w:val="0"/>
+          <w:i w:val="0"/>
+          <w:sz w:val="24"/>
+        </w:rPr>
         <w:t xml:space="preserve">Nygard, M.T. (2018) </w:t>
       </w:r>
       <w:r>
@@ -18354,13 +18574,21 @@
           <w:i w:val="0"/>
           <w:sz w:val="24"/>
         </w:rPr>
-        <w:t>. Available at: https://opentelemetry.io/docs/ (Accessed: 5 October 2026).</w:t>
-      </w:r>
-    </w:p>
-    <w:p>
-      <w:pPr>
-        <w:ind w:left="567" w:hanging="567"/>
-      </w:pPr>
+        <w:t xml:space="preserve">. Available at: </w:t>
+      </w:r>
+      <w:hyperlink r:id="rId38">
+        <w:r>
+          <w:rPr>
+            <w:rFonts w:ascii="Times New Roman" w:hAnsi="Times New Roman" w:eastAsia="Times New Roman" w:cs="Times New Roman"/>
+            <w:b w:val="0"/>
+            <w:i w:val="0"/>
+            <w:color w:val="0563C1"/>
+            <w:sz w:val="24"/>
+            <w:u w:val="single"/>
+          </w:rPr>
+          <w:t>https://opentelemetry.io/docs/</w:t>
+        </w:r>
+      </w:hyperlink>
       <w:r>
         <w:rPr>
           <w:rFonts w:ascii="Times New Roman" w:hAnsi="Times New Roman" w:eastAsia="Times New Roman" w:cs="Times New Roman"/>
@@ -18368,6 +18596,20 @@
           <w:i w:val="0"/>
           <w:sz w:val="24"/>
         </w:rPr>
+        <w:t xml:space="preserve"> (Accessed: 5 October 2026).</w:t>
+      </w:r>
+    </w:p>
+    <w:p>
+      <w:pPr>
+        <w:ind w:left="567" w:hanging="567"/>
+      </w:pPr>
+      <w:r>
+        <w:rPr>
+          <w:rFonts w:ascii="Times New Roman" w:hAnsi="Times New Roman" w:eastAsia="Times New Roman" w:cs="Times New Roman"/>
+          <w:b w:val="0"/>
+          <w:i w:val="0"/>
+          <w:sz w:val="24"/>
+        </w:rPr>
         <w:t xml:space="preserve">Pact Foundation (n.d.) </w:t>
       </w:r>
       <w:r>
@@ -18386,13 +18628,21 @@
           <w:i w:val="0"/>
           <w:sz w:val="24"/>
         </w:rPr>
-        <w:t>. Available at: https://docs.pact.io/ (Accessed: 5 October 2026).</w:t>
-      </w:r>
-    </w:p>
-    <w:p>
-      <w:pPr>
-        <w:ind w:left="567" w:hanging="567"/>
-      </w:pPr>
+        <w:t xml:space="preserve">. Available at: </w:t>
+      </w:r>
+      <w:hyperlink r:id="rId39">
+        <w:r>
+          <w:rPr>
+            <w:rFonts w:ascii="Times New Roman" w:hAnsi="Times New Roman" w:eastAsia="Times New Roman" w:cs="Times New Roman"/>
+            <w:b w:val="0"/>
+            <w:i w:val="0"/>
+            <w:color w:val="0563C1"/>
+            <w:sz w:val="24"/>
+            <w:u w:val="single"/>
+          </w:rPr>
+          <w:t>https://docs.pact.io/</w:t>
+        </w:r>
+      </w:hyperlink>
       <w:r>
         <w:rPr>
           <w:rFonts w:ascii="Times New Roman" w:hAnsi="Times New Roman" w:eastAsia="Times New Roman" w:cs="Times New Roman"/>
@@ -18400,6 +18650,20 @@
           <w:i w:val="0"/>
           <w:sz w:val="24"/>
         </w:rPr>
+        <w:t xml:space="preserve"> (Accessed: 5 October 2026).</w:t>
+      </w:r>
+    </w:p>
+    <w:p>
+      <w:pPr>
+        <w:ind w:left="567" w:hanging="567"/>
+      </w:pPr>
+      <w:r>
+        <w:rPr>
+          <w:rFonts w:ascii="Times New Roman" w:hAnsi="Times New Roman" w:eastAsia="Times New Roman" w:cs="Times New Roman"/>
+          <w:b w:val="0"/>
+          <w:i w:val="0"/>
+          <w:sz w:val="24"/>
+        </w:rPr>
         <w:t xml:space="preserve">PCI Security Standards Council (2022) </w:t>
       </w:r>
       <w:r>
@@ -18450,13 +18714,21 @@
           <w:i w:val="0"/>
           <w:sz w:val="24"/>
         </w:rPr>
-        <w:t>. Available at: https://www.rabbitmq.com/docs/confirms (Accessed: 5 October 2026).</w:t>
-      </w:r>
-    </w:p>
-    <w:p>
-      <w:pPr>
-        <w:ind w:left="567" w:hanging="567"/>
-      </w:pPr>
+        <w:t xml:space="preserve">. Available at: </w:t>
+      </w:r>
+      <w:hyperlink r:id="rId40">
+        <w:r>
+          <w:rPr>
+            <w:rFonts w:ascii="Times New Roman" w:hAnsi="Times New Roman" w:eastAsia="Times New Roman" w:cs="Times New Roman"/>
+            <w:b w:val="0"/>
+            <w:i w:val="0"/>
+            <w:color w:val="0563C1"/>
+            <w:sz w:val="24"/>
+            <w:u w:val="single"/>
+          </w:rPr>
+          <w:t>https://www.rabbitmq.com/docs/confirms</w:t>
+        </w:r>
+      </w:hyperlink>
       <w:r>
         <w:rPr>
           <w:rFonts w:ascii="Times New Roman" w:hAnsi="Times New Roman" w:eastAsia="Times New Roman" w:cs="Times New Roman"/>
@@ -18464,6 +18736,20 @@
           <w:i w:val="0"/>
           <w:sz w:val="24"/>
         </w:rPr>
+        <w:t xml:space="preserve"> (Accessed: 5 October 2026).</w:t>
+      </w:r>
+    </w:p>
+    <w:p>
+      <w:pPr>
+        <w:ind w:left="567" w:hanging="567"/>
+      </w:pPr>
+      <w:r>
+        <w:rPr>
+          <w:rFonts w:ascii="Times New Roman" w:hAnsi="Times New Roman" w:eastAsia="Times New Roman" w:cs="Times New Roman"/>
+          <w:b w:val="0"/>
+          <w:i w:val="0"/>
+          <w:sz w:val="24"/>
+        </w:rPr>
         <w:t xml:space="preserve">Richardson, C. (2018) </w:t>
       </w:r>
       <w:r>
@@ -18514,13 +18800,21 @@
           <w:i w:val="0"/>
           <w:sz w:val="24"/>
         </w:rPr>
-        <w:t>. Available at: https://microservices.io/patterns/data/transactional-outbox.html (Accessed: 5 October 2026).</w:t>
-      </w:r>
-    </w:p>
-    <w:p>
-      <w:pPr>
-        <w:ind w:left="567" w:hanging="567"/>
-      </w:pPr>
+        <w:t xml:space="preserve">. Available at: </w:t>
+      </w:r>
+      <w:hyperlink r:id="rId41">
+        <w:r>
+          <w:rPr>
+            <w:rFonts w:ascii="Times New Roman" w:hAnsi="Times New Roman" w:eastAsia="Times New Roman" w:cs="Times New Roman"/>
+            <w:b w:val="0"/>
+            <w:i w:val="0"/>
+            <w:color w:val="0563C1"/>
+            <w:sz w:val="24"/>
+            <w:u w:val="single"/>
+          </w:rPr>
+          <w:t>https://microservices.io/patterns/data/transactional-outbox.html</w:t>
+        </w:r>
+      </w:hyperlink>
       <w:r>
         <w:rPr>
           <w:rFonts w:ascii="Times New Roman" w:hAnsi="Times New Roman" w:eastAsia="Times New Roman" w:cs="Times New Roman"/>
@@ -18528,6 +18822,20 @@
           <w:i w:val="0"/>
           <w:sz w:val="24"/>
         </w:rPr>
+        <w:t xml:space="preserve"> (Accessed: 5 October 2026).</w:t>
+      </w:r>
+    </w:p>
+    <w:p>
+      <w:pPr>
+        <w:ind w:left="567" w:hanging="567"/>
+      </w:pPr>
+      <w:r>
+        <w:rPr>
+          <w:rFonts w:ascii="Times New Roman" w:hAnsi="Times New Roman" w:eastAsia="Times New Roman" w:cs="Times New Roman"/>
+          <w:b w:val="0"/>
+          <w:i w:val="0"/>
+          <w:sz w:val="24"/>
+        </w:rPr>
         <w:t xml:space="preserve">Rotem-Gal-Oz, A. (2006) </w:t>
       </w:r>
       <w:r>
@@ -18546,13 +18854,21 @@
           <w:i w:val="0"/>
           <w:sz w:val="24"/>
         </w:rPr>
-        <w:t>. Available at: https://www.rgoarchitects.com/Files/fallacies.pdf (Accessed: 5 October 2026).</w:t>
-      </w:r>
-    </w:p>
-    <w:p>
-      <w:pPr>
-        <w:ind w:left="567" w:hanging="567"/>
-      </w:pPr>
+        <w:t xml:space="preserve">. Available at: </w:t>
+      </w:r>
+      <w:hyperlink r:id="rId42">
+        <w:r>
+          <w:rPr>
+            <w:rFonts w:ascii="Times New Roman" w:hAnsi="Times New Roman" w:eastAsia="Times New Roman" w:cs="Times New Roman"/>
+            <w:b w:val="0"/>
+            <w:i w:val="0"/>
+            <w:color w:val="0563C1"/>
+            <w:sz w:val="24"/>
+            <w:u w:val="single"/>
+          </w:rPr>
+          <w:t>https://www.rgoarchitects.com/Files/fallacies.pdf</w:t>
+        </w:r>
+      </w:hyperlink>
       <w:r>
         <w:rPr>
           <w:rFonts w:ascii="Times New Roman" w:hAnsi="Times New Roman" w:eastAsia="Times New Roman" w:cs="Times New Roman"/>
@@ -18560,6 +18876,20 @@
           <w:i w:val="0"/>
           <w:sz w:val="24"/>
         </w:rPr>
+        <w:t xml:space="preserve"> (Accessed: 5 October 2026).</w:t>
+      </w:r>
+    </w:p>
+    <w:p>
+      <w:pPr>
+        <w:ind w:left="567" w:hanging="567"/>
+      </w:pPr>
+      <w:r>
+        <w:rPr>
+          <w:rFonts w:ascii="Times New Roman" w:hAnsi="Times New Roman" w:eastAsia="Times New Roman" w:cs="Times New Roman"/>
+          <w:b w:val="0"/>
+          <w:i w:val="0"/>
+          <w:sz w:val="24"/>
+        </w:rPr>
         <w:t xml:space="preserve">Sato, D. (2014) </w:t>
       </w:r>
       <w:r>
@@ -18578,13 +18908,21 @@
           <w:i w:val="0"/>
           <w:sz w:val="24"/>
         </w:rPr>
-        <w:t>. Available at: https://martinfowler.com/bliki/CanaryRelease.html (Accessed: 5 October 2026).</w:t>
-      </w:r>
-    </w:p>
-    <w:p>
-      <w:pPr>
-        <w:ind w:left="567" w:hanging="567"/>
-      </w:pPr>
+        <w:t xml:space="preserve">. Available at: </w:t>
+      </w:r>
+      <w:hyperlink r:id="rId43">
+        <w:r>
+          <w:rPr>
+            <w:rFonts w:ascii="Times New Roman" w:hAnsi="Times New Roman" w:eastAsia="Times New Roman" w:cs="Times New Roman"/>
+            <w:b w:val="0"/>
+            <w:i w:val="0"/>
+            <w:color w:val="0563C1"/>
+            <w:sz w:val="24"/>
+            <w:u w:val="single"/>
+          </w:rPr>
+          <w:t>https://martinfowler.com/bliki/CanaryRelease.html</w:t>
+        </w:r>
+      </w:hyperlink>
       <w:r>
         <w:rPr>
           <w:rFonts w:ascii="Times New Roman" w:hAnsi="Times New Roman" w:eastAsia="Times New Roman" w:cs="Times New Roman"/>
@@ -18592,6 +18930,20 @@
           <w:i w:val="0"/>
           <w:sz w:val="24"/>
         </w:rPr>
+        <w:t xml:space="preserve"> (Accessed: 5 October 2026).</w:t>
+      </w:r>
+    </w:p>
+    <w:p>
+      <w:pPr>
+        <w:ind w:left="567" w:hanging="567"/>
+      </w:pPr>
+      <w:r>
+        <w:rPr>
+          <w:rFonts w:ascii="Times New Roman" w:hAnsi="Times New Roman" w:eastAsia="Times New Roman" w:cs="Times New Roman"/>
+          <w:b w:val="0"/>
+          <w:i w:val="0"/>
+          <w:sz w:val="24"/>
+        </w:rPr>
         <w:t xml:space="preserve">Skelton, M. and Pais, M. (2019) </w:t>
       </w:r>
       <w:r>
@@ -18642,13 +18994,21 @@
           <w:i w:val="0"/>
           <w:sz w:val="24"/>
         </w:rPr>
-        <w:t>. Available at: https://martinfowler.com/articles/practical-test-pyramid.html (Accessed: 5 October 2026).</w:t>
-      </w:r>
-    </w:p>
-    <w:p>
-      <w:pPr>
-        <w:ind w:left="567" w:hanging="567"/>
-      </w:pPr>
+        <w:t xml:space="preserve">. Available at: </w:t>
+      </w:r>
+      <w:hyperlink r:id="rId44">
+        <w:r>
+          <w:rPr>
+            <w:rFonts w:ascii="Times New Roman" w:hAnsi="Times New Roman" w:eastAsia="Times New Roman" w:cs="Times New Roman"/>
+            <w:b w:val="0"/>
+            <w:i w:val="0"/>
+            <w:color w:val="0563C1"/>
+            <w:sz w:val="24"/>
+            <w:u w:val="single"/>
+          </w:rPr>
+          <w:t>https://martinfowler.com/articles/practical-test-pyramid.html</w:t>
+        </w:r>
+      </w:hyperlink>
       <w:r>
         <w:rPr>
           <w:rFonts w:ascii="Times New Roman" w:hAnsi="Times New Roman" w:eastAsia="Times New Roman" w:cs="Times New Roman"/>
@@ -18656,6 +19016,20 @@
           <w:i w:val="0"/>
           <w:sz w:val="24"/>
         </w:rPr>
+        <w:t xml:space="preserve"> (Accessed: 5 October 2026).</w:t>
+      </w:r>
+    </w:p>
+    <w:p>
+      <w:pPr>
+        <w:ind w:left="567" w:hanging="567"/>
+      </w:pPr>
+      <w:r>
+        <w:rPr>
+          <w:rFonts w:ascii="Times New Roman" w:hAnsi="Times New Roman" w:eastAsia="Times New Roman" w:cs="Times New Roman"/>
+          <w:b w:val="0"/>
+          <w:i w:val="0"/>
+          <w:sz w:val="24"/>
+        </w:rPr>
         <w:t xml:space="preserve">Vogels, W. (2009) 'Eventually consistent', </w:t>
       </w:r>
       <w:r>
@@ -18706,7 +19080,29 @@
           <w:i w:val="0"/>
           <w:sz w:val="24"/>
         </w:rPr>
-        <w:t>. Available at: https://12factor.net/ (Accessed: 5 October 2026).</w:t>
+        <w:t xml:space="preserve">. Available at: </w:t>
+      </w:r>
+      <w:hyperlink r:id="rId45">
+        <w:r>
+          <w:rPr>
+            <w:rFonts w:ascii="Times New Roman" w:hAnsi="Times New Roman" w:eastAsia="Times New Roman" w:cs="Times New Roman"/>
+            <w:b w:val="0"/>
+            <w:i w:val="0"/>
+            <w:color w:val="0563C1"/>
+            <w:sz w:val="24"/>
+            <w:u w:val="single"/>
+          </w:rPr>
+          <w:t>https://12factor.net/</w:t>
+        </w:r>
+      </w:hyperlink>
+      <w:r>
+        <w:rPr>
+          <w:rFonts w:ascii="Times New Roman" w:hAnsi="Times New Roman" w:eastAsia="Times New Roman" w:cs="Times New Roman"/>
+          <w:b w:val="0"/>
+          <w:i w:val="0"/>
+          <w:sz w:val="24"/>
+        </w:rPr>
+        <w:t xml:space="preserve"> (Accessed: 5 October 2026).</w:t>
       </w:r>
     </w:p>
     <w:p>
@@ -18735,15 +19131,19 @@
         </w:rPr>
         <w:t xml:space="preserve">The prototype, its tests, the CI workflow, the diagrams and the scripts that build this report are in a public GitHub repository, shared with the lecturer: </w:t>
       </w:r>
-      <w:r>
-        <w:rPr>
-          <w:rFonts w:ascii="Times New Roman" w:hAnsi="Times New Roman" w:eastAsia="Times New Roman" w:cs="Times New Roman"/>
-          <w:b/>
-          <w:i w:val="0"/>
-          <w:sz w:val="24"/>
-        </w:rPr>
-        <w:t>https://github.com/imranneta5555/maltashop-microservices</w:t>
-      </w:r>
+      <w:hyperlink r:id="rId46">
+        <w:r>
+          <w:rPr>
+            <w:rFonts w:ascii="Times New Roman" w:hAnsi="Times New Roman" w:eastAsia="Times New Roman" w:cs="Times New Roman"/>
+            <w:b/>
+            <w:i w:val="0"/>
+            <w:color w:val="0563C1"/>
+            <w:sz w:val="24"/>
+            <w:u w:val="single"/>
+          </w:rPr>
+          <w:t>https://github.com/imranneta5555/maltashop-microservices</w:t>
+        </w:r>
+      </w:hyperlink>
     </w:p>
     <w:p>
       <w:r>
@@ -19069,7 +19469,7 @@
     <w:p>
       <w:pPr>
         <w:pStyle w:val="CodeListing"/>
-        <w:keepNext w:val="0"/>
+        <w:keepNext/>
         <w:shd w:val="clear" w:color="auto" w:fill="F2F2F2"/>
       </w:pPr>
       <w:r>
@@ -19078,6 +19478,20 @@
           <w:sz w:val="15"/>
         </w:rPr>
         <w:t>343b191  2026-10-05 10:57  report rebuilt with the latest passing ci run</w:t>
+      </w:r>
+    </w:p>
+    <w:p>
+      <w:pPr>
+        <w:pStyle w:val="CodeListing"/>
+        <w:keepNext w:val="0"/>
+        <w:shd w:val="clear" w:color="auto" w:fill="F2F2F2"/>
+      </w:pPr>
+      <w:r>
+        <w:rPr>
+          <w:rFonts w:ascii="Courier New" w:hAnsi="Courier New" w:eastAsia="Courier New" w:cs="Courier New"/>
+          <w:sz w:val="15"/>
+        </w:rPr>
+        <w:t>e6e26d6  2026-10-05 11:36  report rebuilt after the history rewrite</w:t>
       </w:r>
     </w:p>
     <w:p>

</xml_diff>